<commit_message>
Add 2024 dynamic CTF data and plotting updates
Incorporate 2024 closeness-to-frontier data and update plotting logic. The data-cleaning script now uses cliaretl::closeness_to_frontier_dynamic, creates dynamic_ctf_clusters_24, and exports a static indicator definitions CSV. analysis/clusters-over-time.R was updated to use the new 2024 datasets (filtering the Political Institutions cluster and using indicator_cluster_distance_26 for plotting), with older compute_cluster_diff calls commented out. Adjusted ggsave height to 20 in R/pigoanalytics.R and the analysis helper. RoxygenNote bumped to 7.3.3 and multiple package data artifacts (.rda) were refreshed/added to include the new datasets.
</commit_message>
<xml_diff>
--- a/documentation/Public Institutions Global Observatory _ Annual Review 2025_README_revised1.docx
+++ b/documentation/Public Institutions Global Observatory _ Annual Review 2025_README_revised1.docx
@@ -70,21 +70,7 @@
         <w:rPr>
           <w:rFonts w:ascii="Segoe UI Semilight" w:hAnsi="Segoe UI Semilight" w:cs="Segoe UI Semilight"/>
         </w:rPr>
-        <w:t xml:space="preserve">This reproducibility package is designed to recreate all analyses featured in the Public Institutions Global Observatory (PIGO) Annual Review </w:t>
-      </w:r>
-      <w:proofErr w:type="gramStart"/>
-      <w:r>
-        <w:rPr>
-          <w:rFonts w:ascii="Segoe UI Semilight" w:hAnsi="Segoe UI Semilight" w:cs="Segoe UI Semilight"/>
-        </w:rPr>
-        <w:t>2025,</w:t>
-      </w:r>
-      <w:proofErr w:type="gramEnd"/>
-      <w:r>
-        <w:rPr>
-          <w:rFonts w:ascii="Segoe UI Semilight" w:hAnsi="Segoe UI Semilight" w:cs="Segoe UI Semilight"/>
-        </w:rPr>
-        <w:t xml:space="preserve"> a publication produced by the EGVPI. It contains all the necessary data transformation scripts, custom functions, and plotting scripts required to replicate the report’s figures precisely.</w:t>
+        <w:t>This reproducibility package is designed to recreate all analyses featured in the Public Institutions Global Observatory (PIGO) Annual Review 2025, a publication produced by the EGVPI. It contains all the necessary data transformation scripts, custom functions, and plotting scripts required to replicate the report’s figures precisely.</w:t>
       </w:r>
     </w:p>
     <w:p>
@@ -281,12 +267,20 @@
         </w:rPr>
         <w:t xml:space="preserve">Execute the command </w:t>
       </w:r>
+      <w:proofErr w:type="spellStart"/>
       <w:proofErr w:type="gramStart"/>
       <w:r>
         <w:rPr>
           <w:rFonts w:ascii="Segoe UI Semilight" w:hAnsi="Segoe UI Semilight" w:cs="Segoe UI Semilight"/>
         </w:rPr>
-        <w:t>renv::restore(</w:t>
+        <w:t>renv</w:t>
+      </w:r>
+      <w:proofErr w:type="spellEnd"/>
+      <w:r>
+        <w:rPr>
+          <w:rFonts w:ascii="Segoe UI Semilight" w:hAnsi="Segoe UI Semilight" w:cs="Segoe UI Semilight"/>
+        </w:rPr>
+        <w:t>::restore(</w:t>
       </w:r>
       <w:proofErr w:type="gramEnd"/>
       <w:r>
@@ -4642,7 +4636,21 @@
         <w:rPr>
           <w:rFonts w:ascii="Segoe UI Semilight" w:hAnsi="Segoe UI Semilight" w:cs="Segoe UI Semilight"/>
         </w:rPr>
-        <w:t>Dependency Management: renv for managing package dependencies</w:t>
+        <w:t xml:space="preserve">Dependency Management: </w:t>
+      </w:r>
+      <w:proofErr w:type="spellStart"/>
+      <w:r>
+        <w:rPr>
+          <w:rFonts w:ascii="Segoe UI Semilight" w:hAnsi="Segoe UI Semilight" w:cs="Segoe UI Semilight"/>
+        </w:rPr>
+        <w:t>renv</w:t>
+      </w:r>
+      <w:proofErr w:type="spellEnd"/>
+      <w:r>
+        <w:rPr>
+          <w:rFonts w:ascii="Segoe UI Semilight" w:hAnsi="Segoe UI Semilight" w:cs="Segoe UI Semilight"/>
+        </w:rPr>
+        <w:t xml:space="preserve"> for managing package dependencies</w:t>
       </w:r>
     </w:p>
     <w:p>
@@ -4703,20 +4711,35 @@
         <w:rPr>
           <w:rFonts w:ascii="Segoe UI Semilight" w:hAnsi="Segoe UI Semilight" w:cs="Segoe UI Semilight"/>
         </w:rPr>
-        <w:t>Memory: No minimum required, but 16 GB is recommended for optimal performance.</w:t>
-      </w:r>
-    </w:p>
-    <w:p>
-      <w:pPr>
-        <w:rPr>
-          <w:rFonts w:ascii="Segoe UI Semilight" w:hAnsi="Segoe UI Semilight" w:cs="Segoe UI Semilight"/>
-        </w:rPr>
-      </w:pPr>
-      <w:r>
-        <w:rPr>
-          <w:rFonts w:ascii="Segoe UI Semilight" w:hAnsi="Segoe UI Semilight" w:cs="Segoe UI Semilight"/>
-        </w:rPr>
-        <w:t>Run Time: ~</w:t>
+        <w:t xml:space="preserve">Memory: </w:t>
+      </w:r>
+      <w:bookmarkStart w:id="5" w:name="_Hlk218519754"/>
+      <w:r>
+        <w:rPr>
+          <w:rFonts w:ascii="Segoe UI Semilight" w:hAnsi="Segoe UI Semilight" w:cs="Segoe UI Semilight"/>
+        </w:rPr>
+        <w:t>No minimum required, but 16 GB is recommended for optimal performance.</w:t>
+      </w:r>
+      <w:bookmarkEnd w:id="5"/>
+    </w:p>
+    <w:p>
+      <w:pPr>
+        <w:rPr>
+          <w:rFonts w:ascii="Segoe UI Semilight" w:hAnsi="Segoe UI Semilight" w:cs="Segoe UI Semilight"/>
+        </w:rPr>
+      </w:pPr>
+      <w:r>
+        <w:rPr>
+          <w:rFonts w:ascii="Segoe UI Semilight" w:hAnsi="Segoe UI Semilight" w:cs="Segoe UI Semilight"/>
+        </w:rPr>
+        <w:t xml:space="preserve">Run Time: </w:t>
+      </w:r>
+      <w:bookmarkStart w:id="6" w:name="_Hlk218519774"/>
+      <w:r>
+        <w:rPr>
+          <w:rFonts w:ascii="Segoe UI Semilight" w:hAnsi="Segoe UI Semilight" w:cs="Segoe UI Semilight"/>
+        </w:rPr>
+        <w:t>~</w:t>
       </w:r>
       <w:r>
         <w:rPr>
@@ -4730,6 +4753,7 @@
         </w:rPr>
         <w:t xml:space="preserve"> minutes on recommended hardware.</w:t>
       </w:r>
+      <w:bookmarkEnd w:id="6"/>
     </w:p>
     <w:p>
       <w:pPr>
@@ -4751,6 +4775,7 @@
           <w:rFonts w:ascii="Segoe UI Semilight" w:hAnsi="Segoe UI Semilight" w:cs="Segoe UI Semilight"/>
         </w:rPr>
       </w:pPr>
+      <w:bookmarkStart w:id="7" w:name="_Hlk218519813"/>
       <w:r>
         <w:rPr>
           <w:rFonts w:ascii="Segoe UI Semilight" w:hAnsi="Segoe UI Semilight" w:cs="Segoe UI Semilight"/>
@@ -5646,8 +5671,18 @@
           <w:sz w:val="16"/>
           <w:szCs w:val="16"/>
         </w:rPr>
-        <w:t xml:space="preserve"> .Rprofile</w:t>
-      </w:r>
+        <w:t xml:space="preserve"> .</w:t>
+      </w:r>
+      <w:proofErr w:type="spellStart"/>
+      <w:r>
+        <w:rPr>
+          <w:rFonts w:ascii="Segoe UI Semilight" w:eastAsia="MS Gothic" w:hAnsi="Segoe UI Semilight" w:cs="Segoe UI Semilight"/>
+          <w:sz w:val="16"/>
+          <w:szCs w:val="16"/>
+        </w:rPr>
+        <w:t>Rprofile</w:t>
+      </w:r>
+      <w:proofErr w:type="spellEnd"/>
       <w:proofErr w:type="gramEnd"/>
       <w:r>
         <w:rPr>
@@ -5989,7 +6024,9 @@
           <w:rFonts w:ascii="Segoe UI Semilight" w:hAnsi="Segoe UI Semilight" w:cs="Segoe UI Semilight"/>
         </w:rPr>
         <w:sectPr>
-          <w:footerReference w:type="default" r:id="rId26"/>
+          <w:footerReference w:type="even" r:id="rId26"/>
+          <w:footerReference w:type="default" r:id="rId27"/>
+          <w:footerReference w:type="first" r:id="rId28"/>
           <w:pgSz w:w="11906" w:h="16838"/>
           <w:pgMar w:top="1440" w:right="1440" w:bottom="1440" w:left="1440" w:header="708" w:footer="708" w:gutter="0"/>
           <w:cols w:space="720"/>
@@ -6002,6 +6039,7 @@
         </w:rPr>
         <w:br w:type="page"/>
       </w:r>
+      <w:bookmarkEnd w:id="7"/>
     </w:p>
     <w:p>
       <w:pPr>
@@ -6285,7 +6323,7 @@
               </w:rPr>
               <w:t xml:space="preserve">Image. Source: </w:t>
             </w:r>
-            <w:hyperlink r:id="rId27" w:history="1">
+            <w:hyperlink r:id="rId29" w:history="1">
               <w:r>
                 <w:rPr>
                   <w:rStyle w:val="Hyperlink"/>
@@ -8244,7 +8282,7 @@
               </w:rPr>
               <w:br/>
             </w:r>
-            <w:hyperlink r:id="rId28" w:history="1">
+            <w:hyperlink r:id="rId30" w:history="1">
               <w:r>
                 <w:rPr>
                   <w:rStyle w:val="Hyperlink"/>
@@ -9161,7 +9199,7 @@
                 <w:szCs w:val="18"/>
               </w:rPr>
             </w:pPr>
-            <w:bookmarkStart w:id="5" w:name="RANGE!B26"/>
+            <w:bookmarkStart w:id="8" w:name="RANGE!B26"/>
             <w:r>
               <w:rPr>
                 <w:rFonts w:ascii="Segoe UI Semilight" w:hAnsi="Segoe UI Semilight" w:cs="Segoe UI Semilight"/>
@@ -9173,7 +9211,7 @@
               </w:rPr>
               <w:t>Annex 1. Additional Correlations between Institutional Dimensions and Prosperity Indicators (a)</w:t>
             </w:r>
-            <w:bookmarkEnd w:id="5"/>
+            <w:bookmarkEnd w:id="8"/>
           </w:p>
         </w:tc>
         <w:tc>
@@ -10064,25 +10102,255 @@
 
 <file path=word/footer1.xml><?xml version="1.0" encoding="utf-8"?>
 <w:ftr xmlns:wpc="http://schemas.microsoft.com/office/word/2010/wordprocessingCanvas" xmlns:cx="http://schemas.microsoft.com/office/drawing/2014/chartex" xmlns:cx1="http://schemas.microsoft.com/office/drawing/2015/9/8/chartex" xmlns:cx2="http://schemas.microsoft.com/office/drawing/2015/10/21/chartex" xmlns:cx3="http://schemas.microsoft.com/office/drawing/2016/5/9/chartex" xmlns:cx4="http://schemas.microsoft.com/office/drawing/2016/5/10/chartex" xmlns:cx5="http://schemas.microsoft.com/office/drawing/2016/5/11/chartex" xmlns:cx6="http://schemas.microsoft.com/office/drawing/2016/5/12/chartex" xmlns:cx7="http://schemas.microsoft.com/office/drawing/2016/5/13/chartex" xmlns:cx8="http://schemas.microsoft.com/office/drawing/2016/5/14/chartex" xmlns:mc="http://schemas.openxmlformats.org/markup-compatibility/2006" xmlns:aink="http://schemas.microsoft.com/office/drawing/2016/ink" xmlns:am3d="http://schemas.microsoft.com/office/drawing/2017/model3d" xmlns:o="urn:schemas-microsoft-com:office:office" xmlns:oel="http://schemas.microsoft.com/office/2019/extlst" xmlns:r="http://schemas.openxmlformats.org/officeDocument/2006/relationships" xmlns:m="http://schemas.openxmlformats.org/officeDocument/2006/math" xmlns:v="urn:schemas-microsoft-com:vml" xmlns:wp14="http://schemas.microsoft.com/office/word/2010/wordprocessingDrawing" xmlns:wp="http://schemas.openxmlformats.org/drawingml/2006/wordprocessingDrawing" xmlns:w10="urn:schemas-microsoft-com:office:word" xmlns:w="http://schemas.openxmlformats.org/wordprocessingml/2006/main" xmlns:w14="http://schemas.microsoft.com/office/word/2010/wordml" xmlns:w15="http://schemas.microsoft.com/office/word/2012/wordml" xmlns:w16cex="http://schemas.microsoft.com/office/word/2018/wordml/cex" xmlns:w16cid="http://schemas.microsoft.com/office/word/2016/wordml/cid" xmlns:w16="http://schemas.microsoft.com/office/word/2018/wordml" xmlns:w16du="http://schemas.microsoft.com/office/word/2023/wordml/word16du" xmlns:w16sdtdh="http://schemas.microsoft.com/office/word/2020/wordml/sdtdatahash" xmlns:w16sdtfl="http://schemas.microsoft.com/office/word/2024/wordml/sdtformatlock" xmlns:w16se="http://schemas.microsoft.com/office/word/2015/wordml/symex" xmlns:wpg="http://schemas.microsoft.com/office/word/2010/wordprocessingGroup" xmlns:wpi="http://schemas.microsoft.com/office/word/2010/wordprocessingInk" xmlns:wne="http://schemas.microsoft.com/office/word/2006/wordml" xmlns:wps="http://schemas.microsoft.com/office/word/2010/wordprocessingShape" mc:Ignorable="w14 w15 w16se w16cid w16 w16cex w16sdtdh w16sdtfl w16du wp14">
-  <w:sdt>
-    <w:sdtPr>
-      <w:id w:val="-343861803"/>
-      <w:docPartObj>
-        <w:docPartGallery w:val="Page Numbers (Bottom of Page)"/>
-        <w:docPartUnique/>
-      </w:docPartObj>
-    </w:sdtPr>
-    <w:sdtEndPr>
+  <w:p>
+    <w:pPr>
+      <w:pStyle w:val="Footer"/>
+    </w:pPr>
+    <w:r>
       <w:rPr>
         <w:noProof/>
       </w:rPr>
-    </w:sdtEndPr>
-    <w:sdtContent>
-      <w:p>
-        <w:pPr>
-          <w:pStyle w:val="Footer"/>
-          <w:jc w:val="right"/>
-        </w:pPr>
+      <mc:AlternateContent>
+        <mc:Choice Requires="wps">
+          <w:drawing>
+            <wp:anchor distT="0" distB="0" distL="0" distR="0" simplePos="0" relativeHeight="251659264" behindDoc="0" locked="0" layoutInCell="1" allowOverlap="1" wp14:anchorId="71767028" wp14:editId="4F69DF04">
+              <wp:simplePos x="635" y="635"/>
+              <wp:positionH relativeFrom="page">
+                <wp:align>right</wp:align>
+              </wp:positionH>
+              <wp:positionV relativeFrom="page">
+                <wp:align>bottom</wp:align>
+              </wp:positionV>
+              <wp:extent cx="1172210" cy="345440"/>
+              <wp:effectExtent l="0" t="0" r="0" b="0"/>
+              <wp:wrapNone/>
+              <wp:docPr id="1995562125" name="Text Box 2" descr="Official Use Only">
+                <a:extLst xmlns:a="http://schemas.openxmlformats.org/drawingml/2006/main">
+                  <a:ext uri="{5AE41FA2-C0FF-4470-9BD4-5FADCA87CBE2}">
+                    <aclsh:classification xmlns:aclsh="http://schemas.microsoft.com/office/drawing/2020/classificationShape" classificationOutcomeType="ftr"/>
+                  </a:ext>
+                </a:extLst>
+              </wp:docPr>
+              <wp:cNvGraphicFramePr/>
+              <a:graphic xmlns:a="http://schemas.openxmlformats.org/drawingml/2006/main">
+                <a:graphicData uri="http://schemas.microsoft.com/office/word/2010/wordprocessingShape">
+                  <wps:wsp>
+                    <wps:cNvSpPr txBox="1"/>
+                    <wps:spPr>
+                      <a:xfrm>
+                        <a:off x="0" y="0"/>
+                        <a:ext cx="1172210" cy="345440"/>
+                      </a:xfrm>
+                      <a:prstGeom prst="rect">
+                        <a:avLst/>
+                      </a:prstGeom>
+                      <a:noFill/>
+                      <a:ln>
+                        <a:noFill/>
+                      </a:ln>
+                    </wps:spPr>
+                    <wps:txbx>
+                      <w:txbxContent>
+                        <w:p>
+                          <w:pPr>
+                            <w:rPr>
+                              <w:rFonts w:ascii="Aptos" w:eastAsia="Aptos" w:hAnsi="Aptos" w:cs="Aptos"/>
+                              <w:noProof/>
+                              <w:color w:val="000000"/>
+                            </w:rPr>
+                          </w:pPr>
+                          <w:r>
+                            <w:rPr>
+                              <w:rFonts w:ascii="Aptos" w:eastAsia="Aptos" w:hAnsi="Aptos" w:cs="Aptos"/>
+                              <w:noProof/>
+                              <w:color w:val="000000"/>
+                            </w:rPr>
+                            <w:t>Official Use Only</w:t>
+                          </w:r>
+                        </w:p>
+                      </w:txbxContent>
+                    </wps:txbx>
+                    <wps:bodyPr rot="0" spcFirstLastPara="0" vertOverflow="overflow" horzOverflow="overflow" vert="horz" wrap="none" lIns="0" tIns="0" rIns="254000" bIns="190500" numCol="1" spcCol="0" rtlCol="0" fromWordArt="0" anchor="b" anchorCtr="0" forceAA="0" compatLnSpc="1">
+                      <a:prstTxWarp prst="textNoShape">
+                        <a:avLst/>
+                      </a:prstTxWarp>
+                      <a:spAutoFit/>
+                    </wps:bodyPr>
+                  </wps:wsp>
+                </a:graphicData>
+              </a:graphic>
+            </wp:anchor>
+          </w:drawing>
+        </mc:Choice>
+        <mc:Fallback>
+          <w:pict>
+            <v:shapetype w14:anchorId="71767028" id="_x0000_t202" coordsize="21600,21600" o:spt="202" path="m,l,21600r21600,l21600,xe">
+              <v:stroke joinstyle="miter"/>
+              <v:path gradientshapeok="t" o:connecttype="rect"/>
+            </v:shapetype>
+            <v:shape id="Text Box 2" o:spid="_x0000_s1026" type="#_x0000_t202" alt="Official Use Only" style="position:absolute;margin-left:41.1pt;margin-top:0;width:92.3pt;height:27.2pt;z-index:251659264;visibility:visible;mso-wrap-style:none;mso-wrap-distance-left:0;mso-wrap-distance-top:0;mso-wrap-distance-right:0;mso-wrap-distance-bottom:0;mso-position-horizontal:right;mso-position-horizontal-relative:page;mso-position-vertical:bottom;mso-position-vertical-relative:page;v-text-anchor:bottom" o:gfxdata="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" filled="f" stroked="f">
+              <v:textbox style="mso-fit-shape-to-text:t" inset="0,0,20pt,15pt">
+                <w:txbxContent>
+                  <w:p>
+                    <w:pPr>
+                      <w:rPr>
+                        <w:rFonts w:ascii="Aptos" w:eastAsia="Aptos" w:hAnsi="Aptos" w:cs="Aptos"/>
+                        <w:noProof/>
+                        <w:color w:val="000000"/>
+                      </w:rPr>
+                    </w:pPr>
+                    <w:r>
+                      <w:rPr>
+                        <w:rFonts w:ascii="Aptos" w:eastAsia="Aptos" w:hAnsi="Aptos" w:cs="Aptos"/>
+                        <w:noProof/>
+                        <w:color w:val="000000"/>
+                      </w:rPr>
+                      <w:t>Official Use Only</w:t>
+                    </w:r>
+                  </w:p>
+                </w:txbxContent>
+              </v:textbox>
+              <w10:wrap anchorx="page" anchory="page"/>
+            </v:shape>
+          </w:pict>
+        </mc:Fallback>
+      </mc:AlternateContent>
+    </w:r>
+  </w:p>
+</w:ftr>
+</file>
+
+<file path=word/footer2.xml><?xml version="1.0" encoding="utf-8"?>
+<w:ftr xmlns:wpc="http://schemas.microsoft.com/office/word/2010/wordprocessingCanvas" xmlns:cx="http://schemas.microsoft.com/office/drawing/2014/chartex" xmlns:cx1="http://schemas.microsoft.com/office/drawing/2015/9/8/chartex" xmlns:cx2="http://schemas.microsoft.com/office/drawing/2015/10/21/chartex" xmlns:cx3="http://schemas.microsoft.com/office/drawing/2016/5/9/chartex" xmlns:cx4="http://schemas.microsoft.com/office/drawing/2016/5/10/chartex" xmlns:cx5="http://schemas.microsoft.com/office/drawing/2016/5/11/chartex" xmlns:cx6="http://schemas.microsoft.com/office/drawing/2016/5/12/chartex" xmlns:cx7="http://schemas.microsoft.com/office/drawing/2016/5/13/chartex" xmlns:cx8="http://schemas.microsoft.com/office/drawing/2016/5/14/chartex" xmlns:mc="http://schemas.openxmlformats.org/markup-compatibility/2006" xmlns:aink="http://schemas.microsoft.com/office/drawing/2016/ink" xmlns:am3d="http://schemas.microsoft.com/office/drawing/2017/model3d" xmlns:o="urn:schemas-microsoft-com:office:office" xmlns:oel="http://schemas.microsoft.com/office/2019/extlst" xmlns:r="http://schemas.openxmlformats.org/officeDocument/2006/relationships" xmlns:m="http://schemas.openxmlformats.org/officeDocument/2006/math" xmlns:v="urn:schemas-microsoft-com:vml" xmlns:wp14="http://schemas.microsoft.com/office/word/2010/wordprocessingDrawing" xmlns:wp="http://schemas.openxmlformats.org/drawingml/2006/wordprocessingDrawing" xmlns:w10="urn:schemas-microsoft-com:office:word" xmlns:w="http://schemas.openxmlformats.org/wordprocessingml/2006/main" xmlns:w14="http://schemas.microsoft.com/office/word/2010/wordml" xmlns:w15="http://schemas.microsoft.com/office/word/2012/wordml" xmlns:w16cex="http://schemas.microsoft.com/office/word/2018/wordml/cex" xmlns:w16cid="http://schemas.microsoft.com/office/word/2016/wordml/cid" xmlns:w16="http://schemas.microsoft.com/office/word/2018/wordml" xmlns:w16du="http://schemas.microsoft.com/office/word/2023/wordml/word16du" xmlns:w16sdtdh="http://schemas.microsoft.com/office/word/2020/wordml/sdtdatahash" xmlns:w16sdtfl="http://schemas.microsoft.com/office/word/2024/wordml/sdtformatlock" xmlns:w16se="http://schemas.microsoft.com/office/word/2015/wordml/symex" xmlns:wpg="http://schemas.microsoft.com/office/word/2010/wordprocessingGroup" xmlns:wpi="http://schemas.microsoft.com/office/word/2010/wordprocessingInk" xmlns:wne="http://schemas.microsoft.com/office/word/2006/wordml" xmlns:wps="http://schemas.microsoft.com/office/word/2010/wordprocessingShape" mc:Ignorable="w14 w15 w16se w16cid w16 w16cex w16sdtdh w16sdtfl w16du wp14">
+  <w:p>
+    <w:pPr>
+      <w:pStyle w:val="Footer"/>
+      <w:jc w:val="right"/>
+    </w:pPr>
+    <w:r>
+      <w:rPr>
+        <w:noProof/>
+      </w:rPr>
+      <mc:AlternateContent>
+        <mc:Choice Requires="wps">
+          <w:drawing>
+            <wp:anchor distT="0" distB="0" distL="0" distR="0" simplePos="0" relativeHeight="251660288" behindDoc="0" locked="0" layoutInCell="1" allowOverlap="1" wp14:anchorId="216146F0" wp14:editId="30BD5818">
+              <wp:simplePos x="914400" y="9949639"/>
+              <wp:positionH relativeFrom="page">
+                <wp:align>right</wp:align>
+              </wp:positionH>
+              <wp:positionV relativeFrom="page">
+                <wp:align>bottom</wp:align>
+              </wp:positionV>
+              <wp:extent cx="1172210" cy="345440"/>
+              <wp:effectExtent l="0" t="0" r="0" b="0"/>
+              <wp:wrapNone/>
+              <wp:docPr id="409453109" name="Text Box 3" descr="Official Use Only">
+                <a:extLst xmlns:a="http://schemas.openxmlformats.org/drawingml/2006/main">
+                  <a:ext uri="{5AE41FA2-C0FF-4470-9BD4-5FADCA87CBE2}">
+                    <aclsh:classification xmlns:aclsh="http://schemas.microsoft.com/office/drawing/2020/classificationShape" classificationOutcomeType="ftr"/>
+                  </a:ext>
+                </a:extLst>
+              </wp:docPr>
+              <wp:cNvGraphicFramePr/>
+              <a:graphic xmlns:a="http://schemas.openxmlformats.org/drawingml/2006/main">
+                <a:graphicData uri="http://schemas.microsoft.com/office/word/2010/wordprocessingShape">
+                  <wps:wsp>
+                    <wps:cNvSpPr txBox="1"/>
+                    <wps:spPr>
+                      <a:xfrm>
+                        <a:off x="0" y="0"/>
+                        <a:ext cx="1172210" cy="345440"/>
+                      </a:xfrm>
+                      <a:prstGeom prst="rect">
+                        <a:avLst/>
+                      </a:prstGeom>
+                      <a:noFill/>
+                      <a:ln>
+                        <a:noFill/>
+                      </a:ln>
+                    </wps:spPr>
+                    <wps:txbx>
+                      <w:txbxContent>
+                        <w:p>
+                          <w:pPr>
+                            <w:rPr>
+                              <w:rFonts w:ascii="Aptos" w:eastAsia="Aptos" w:hAnsi="Aptos" w:cs="Aptos"/>
+                              <w:noProof/>
+                              <w:color w:val="000000"/>
+                            </w:rPr>
+                          </w:pPr>
+                          <w:r>
+                            <w:rPr>
+                              <w:rFonts w:ascii="Aptos" w:eastAsia="Aptos" w:hAnsi="Aptos" w:cs="Aptos"/>
+                              <w:noProof/>
+                              <w:color w:val="000000"/>
+                            </w:rPr>
+                            <w:t>Official Use Only</w:t>
+                          </w:r>
+                        </w:p>
+                      </w:txbxContent>
+                    </wps:txbx>
+                    <wps:bodyPr rot="0" spcFirstLastPara="0" vertOverflow="overflow" horzOverflow="overflow" vert="horz" wrap="none" lIns="0" tIns="0" rIns="254000" bIns="190500" numCol="1" spcCol="0" rtlCol="0" fromWordArt="0" anchor="b" anchorCtr="0" forceAA="0" compatLnSpc="1">
+                      <a:prstTxWarp prst="textNoShape">
+                        <a:avLst/>
+                      </a:prstTxWarp>
+                      <a:spAutoFit/>
+                    </wps:bodyPr>
+                  </wps:wsp>
+                </a:graphicData>
+              </a:graphic>
+            </wp:anchor>
+          </w:drawing>
+        </mc:Choice>
+        <mc:Fallback>
+          <w:pict>
+            <v:shapetype w14:anchorId="216146F0" id="_x0000_t202" coordsize="21600,21600" o:spt="202" path="m,l,21600r21600,l21600,xe">
+              <v:stroke joinstyle="miter"/>
+              <v:path gradientshapeok="t" o:connecttype="rect"/>
+            </v:shapetype>
+            <v:shape id="Text Box 3" o:spid="_x0000_s1027" type="#_x0000_t202" alt="Official Use Only" style="position:absolute;left:0;text-align:left;margin-left:41.1pt;margin-top:0;width:92.3pt;height:27.2pt;z-index:251660288;visibility:visible;mso-wrap-style:none;mso-wrap-distance-left:0;mso-wrap-distance-top:0;mso-wrap-distance-right:0;mso-wrap-distance-bottom:0;mso-position-horizontal:right;mso-position-horizontal-relative:page;mso-position-vertical:bottom;mso-position-vertical-relative:page;v-text-anchor:bottom" o:gfxdata="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" filled="f" stroked="f">
+              <v:textbox style="mso-fit-shape-to-text:t" inset="0,0,20pt,15pt">
+                <w:txbxContent>
+                  <w:p>
+                    <w:pPr>
+                      <w:rPr>
+                        <w:rFonts w:ascii="Aptos" w:eastAsia="Aptos" w:hAnsi="Aptos" w:cs="Aptos"/>
+                        <w:noProof/>
+                        <w:color w:val="000000"/>
+                      </w:rPr>
+                    </w:pPr>
+                    <w:r>
+                      <w:rPr>
+                        <w:rFonts w:ascii="Aptos" w:eastAsia="Aptos" w:hAnsi="Aptos" w:cs="Aptos"/>
+                        <w:noProof/>
+                        <w:color w:val="000000"/>
+                      </w:rPr>
+                      <w:t>Official Use Only</w:t>
+                    </w:r>
+                  </w:p>
+                </w:txbxContent>
+              </v:textbox>
+              <w10:wrap anchorx="page" anchory="page"/>
+            </v:shape>
+          </w:pict>
+        </mc:Fallback>
+      </mc:AlternateContent>
+    </w:r>
+    <w:sdt>
+      <w:sdtPr>
+        <w:id w:val="-343861803"/>
+        <w:docPartObj>
+          <w:docPartGallery w:val="Page Numbers (Bottom of Page)"/>
+          <w:docPartUnique/>
+        </w:docPartObj>
+      </w:sdtPr>
+      <w:sdtEndPr>
+        <w:rPr>
+          <w:noProof/>
+        </w:rPr>
+      </w:sdtEndPr>
+      <w:sdtContent>
         <w:r>
           <w:fldChar w:fldCharType="begin"/>
         </w:r>
@@ -10104,13 +10372,133 @@
           </w:rPr>
           <w:fldChar w:fldCharType="end"/>
         </w:r>
-      </w:p>
-    </w:sdtContent>
-  </w:sdt>
+      </w:sdtContent>
+    </w:sdt>
+  </w:p>
   <w:p>
     <w:pPr>
       <w:pStyle w:val="Footer"/>
     </w:pPr>
+  </w:p>
+</w:ftr>
+</file>
+
+<file path=word/footer3.xml><?xml version="1.0" encoding="utf-8"?>
+<w:ftr xmlns:wpc="http://schemas.microsoft.com/office/word/2010/wordprocessingCanvas" xmlns:cx="http://schemas.microsoft.com/office/drawing/2014/chartex" xmlns:cx1="http://schemas.microsoft.com/office/drawing/2015/9/8/chartex" xmlns:cx2="http://schemas.microsoft.com/office/drawing/2015/10/21/chartex" xmlns:cx3="http://schemas.microsoft.com/office/drawing/2016/5/9/chartex" xmlns:cx4="http://schemas.microsoft.com/office/drawing/2016/5/10/chartex" xmlns:cx5="http://schemas.microsoft.com/office/drawing/2016/5/11/chartex" xmlns:cx6="http://schemas.microsoft.com/office/drawing/2016/5/12/chartex" xmlns:cx7="http://schemas.microsoft.com/office/drawing/2016/5/13/chartex" xmlns:cx8="http://schemas.microsoft.com/office/drawing/2016/5/14/chartex" xmlns:mc="http://schemas.openxmlformats.org/markup-compatibility/2006" xmlns:aink="http://schemas.microsoft.com/office/drawing/2016/ink" xmlns:am3d="http://schemas.microsoft.com/office/drawing/2017/model3d" xmlns:o="urn:schemas-microsoft-com:office:office" xmlns:oel="http://schemas.microsoft.com/office/2019/extlst" xmlns:r="http://schemas.openxmlformats.org/officeDocument/2006/relationships" xmlns:m="http://schemas.openxmlformats.org/officeDocument/2006/math" xmlns:v="urn:schemas-microsoft-com:vml" xmlns:wp14="http://schemas.microsoft.com/office/word/2010/wordprocessingDrawing" xmlns:wp="http://schemas.openxmlformats.org/drawingml/2006/wordprocessingDrawing" xmlns:w10="urn:schemas-microsoft-com:office:word" xmlns:w="http://schemas.openxmlformats.org/wordprocessingml/2006/main" xmlns:w14="http://schemas.microsoft.com/office/word/2010/wordml" xmlns:w15="http://schemas.microsoft.com/office/word/2012/wordml" xmlns:w16cex="http://schemas.microsoft.com/office/word/2018/wordml/cex" xmlns:w16cid="http://schemas.microsoft.com/office/word/2016/wordml/cid" xmlns:w16="http://schemas.microsoft.com/office/word/2018/wordml" xmlns:w16du="http://schemas.microsoft.com/office/word/2023/wordml/word16du" xmlns:w16sdtdh="http://schemas.microsoft.com/office/word/2020/wordml/sdtdatahash" xmlns:w16sdtfl="http://schemas.microsoft.com/office/word/2024/wordml/sdtformatlock" xmlns:w16se="http://schemas.microsoft.com/office/word/2015/wordml/symex" xmlns:wpg="http://schemas.microsoft.com/office/word/2010/wordprocessingGroup" xmlns:wpi="http://schemas.microsoft.com/office/word/2010/wordprocessingInk" xmlns:wne="http://schemas.microsoft.com/office/word/2006/wordml" xmlns:wps="http://schemas.microsoft.com/office/word/2010/wordprocessingShape" mc:Ignorable="w14 w15 w16se w16cid w16 w16cex w16sdtdh w16sdtfl w16du wp14">
+  <w:p>
+    <w:pPr>
+      <w:pStyle w:val="Footer"/>
+    </w:pPr>
+    <w:r>
+      <w:rPr>
+        <w:noProof/>
+      </w:rPr>
+      <mc:AlternateContent>
+        <mc:Choice Requires="wps">
+          <w:drawing>
+            <wp:anchor distT="0" distB="0" distL="0" distR="0" simplePos="0" relativeHeight="251658240" behindDoc="0" locked="0" layoutInCell="1" allowOverlap="1" wp14:anchorId="7EFAD078" wp14:editId="5B23DE3E">
+              <wp:simplePos x="635" y="635"/>
+              <wp:positionH relativeFrom="page">
+                <wp:align>right</wp:align>
+              </wp:positionH>
+              <wp:positionV relativeFrom="page">
+                <wp:align>bottom</wp:align>
+              </wp:positionV>
+              <wp:extent cx="1172210" cy="345440"/>
+              <wp:effectExtent l="0" t="0" r="0" b="0"/>
+              <wp:wrapNone/>
+              <wp:docPr id="232773304" name="Text Box 1" descr="Official Use Only">
+                <a:extLst xmlns:a="http://schemas.openxmlformats.org/drawingml/2006/main">
+                  <a:ext uri="{5AE41FA2-C0FF-4470-9BD4-5FADCA87CBE2}">
+                    <aclsh:classification xmlns:aclsh="http://schemas.microsoft.com/office/drawing/2020/classificationShape" classificationOutcomeType="ftr"/>
+                  </a:ext>
+                </a:extLst>
+              </wp:docPr>
+              <wp:cNvGraphicFramePr/>
+              <a:graphic xmlns:a="http://schemas.openxmlformats.org/drawingml/2006/main">
+                <a:graphicData uri="http://schemas.microsoft.com/office/word/2010/wordprocessingShape">
+                  <wps:wsp>
+                    <wps:cNvSpPr txBox="1"/>
+                    <wps:spPr>
+                      <a:xfrm>
+                        <a:off x="0" y="0"/>
+                        <a:ext cx="1172210" cy="345440"/>
+                      </a:xfrm>
+                      <a:prstGeom prst="rect">
+                        <a:avLst/>
+                      </a:prstGeom>
+                      <a:noFill/>
+                      <a:ln>
+                        <a:noFill/>
+                      </a:ln>
+                    </wps:spPr>
+                    <wps:txbx>
+                      <w:txbxContent>
+                        <w:p>
+                          <w:pPr>
+                            <w:rPr>
+                              <w:rFonts w:ascii="Aptos" w:eastAsia="Aptos" w:hAnsi="Aptos" w:cs="Aptos"/>
+                              <w:noProof/>
+                              <w:color w:val="000000"/>
+                            </w:rPr>
+                          </w:pPr>
+                          <w:r>
+                            <w:rPr>
+                              <w:rFonts w:ascii="Aptos" w:eastAsia="Aptos" w:hAnsi="Aptos" w:cs="Aptos"/>
+                              <w:noProof/>
+                              <w:color w:val="000000"/>
+                            </w:rPr>
+                            <w:t>Official Use Only</w:t>
+                          </w:r>
+                        </w:p>
+                      </w:txbxContent>
+                    </wps:txbx>
+                    <wps:bodyPr rot="0" spcFirstLastPara="0" vertOverflow="overflow" horzOverflow="overflow" vert="horz" wrap="none" lIns="0" tIns="0" rIns="254000" bIns="190500" numCol="1" spcCol="0" rtlCol="0" fromWordArt="0" anchor="b" anchorCtr="0" forceAA="0" compatLnSpc="1">
+                      <a:prstTxWarp prst="textNoShape">
+                        <a:avLst/>
+                      </a:prstTxWarp>
+                      <a:spAutoFit/>
+                    </wps:bodyPr>
+                  </wps:wsp>
+                </a:graphicData>
+              </a:graphic>
+            </wp:anchor>
+          </w:drawing>
+        </mc:Choice>
+        <mc:Fallback>
+          <w:pict>
+            <v:shapetype w14:anchorId="7EFAD078" id="_x0000_t202" coordsize="21600,21600" o:spt="202" path="m,l,21600r21600,l21600,xe">
+              <v:stroke joinstyle="miter"/>
+              <v:path gradientshapeok="t" o:connecttype="rect"/>
+            </v:shapetype>
+            <v:shape id="Text Box 1" o:spid="_x0000_s1028" type="#_x0000_t202" alt="Official Use Only" style="position:absolute;margin-left:41.1pt;margin-top:0;width:92.3pt;height:27.2pt;z-index:251658240;visibility:visible;mso-wrap-style:none;mso-wrap-distance-left:0;mso-wrap-distance-top:0;mso-wrap-distance-right:0;mso-wrap-distance-bottom:0;mso-position-horizontal:right;mso-position-horizontal-relative:page;mso-position-vertical:bottom;mso-position-vertical-relative:page;v-text-anchor:bottom" o:gfxdata="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" filled="f" stroked="f">
+              <v:textbox style="mso-fit-shape-to-text:t" inset="0,0,20pt,15pt">
+                <w:txbxContent>
+                  <w:p>
+                    <w:pPr>
+                      <w:rPr>
+                        <w:rFonts w:ascii="Aptos" w:eastAsia="Aptos" w:hAnsi="Aptos" w:cs="Aptos"/>
+                        <w:noProof/>
+                        <w:color w:val="000000"/>
+                      </w:rPr>
+                    </w:pPr>
+                    <w:r>
+                      <w:rPr>
+                        <w:rFonts w:ascii="Aptos" w:eastAsia="Aptos" w:hAnsi="Aptos" w:cs="Aptos"/>
+                        <w:noProof/>
+                        <w:color w:val="000000"/>
+                      </w:rPr>
+                      <w:t>Official Use Only</w:t>
+                    </w:r>
+                  </w:p>
+                </w:txbxContent>
+              </v:textbox>
+              <w10:wrap anchorx="page" anchory="page"/>
+            </v:shape>
+          </w:pict>
+        </mc:Fallback>
+      </mc:AlternateContent>
+    </w:r>
   </w:p>
 </w:ftr>
 </file>

</xml_diff>